<commit_message>
feat: CV template full body image layout improvements and server diagnostics
</commit_message>
<xml_diff>
--- a/server/templates/CV ALM.docx
+++ b/server/templates/CV ALM.docx
@@ -504,35 +504,34 @@
       <w:tr>
         <w:tc>
           <w:tcPr>
-            <w:tcW w:type="pct" w:w="30%"/>
+            <w:tcW w:type="pct" w:w="35%"/>
             <w:tcBorders>
               <w:top w:val="single" w:color="000000" w:sz="4"/>
               <w:left w:val="single" w:color="000000" w:sz="4"/>
               <w:bottom w:val="single" w:color="000000" w:sz="4"/>
               <w:right w:val="single" w:color="000000" w:sz="4"/>
             </w:tcBorders>
+            <w:tcMar>
+              <w:top w:type="dxa" w:w="0"/>
+              <w:left w:type="dxa" w:w="0"/>
+              <w:bottom w:type="dxa" w:w="0"/>
+              <w:right w:type="dxa" w:w="0"/>
+            </w:tcMar>
             <w:vAlign w:val="center"/>
           </w:tcPr>
           <w:p>
             <w:pPr>
+              <w:spacing w:after="0" w:before="0"/>
               <w:jc w:val="center"/>
             </w:pPr>
             <w:r>
-              <w:rPr>
-                <w:rFonts w:ascii="Times New Roman" w:cs="Times New Roman" w:eastAsia="Times New Roman" w:hAnsi="Times New Roman"/>
-                <w:b w:val="false"/>
-                <w:bCs w:val="false"/>
-                <w:color w:val="000000"/>
-                <w:sz w:val="24"/>
-                <w:szCs w:val="24"/>
-              </w:rPr>
               <w:t xml:space="preserve">{%fullBodyPhoto}</w:t>
             </w:r>
           </w:p>
         </w:tc>
         <w:tc>
           <w:tcPr>
-            <w:tcW w:type="pct" w:w="70%"/>
+            <w:tcW w:type="pct" w:w="65%"/>
             <w:tcBorders>
               <w:top w:val="none" w:color="auto" w:sz="0"/>
               <w:left w:val="none" w:color="auto" w:sz="0"/>

</xml_diff>